<commit_message>
Add instructional visuals to Modules 8 through 11
</commit_message>
<xml_diff>
--- a/Tutorials/Module 10/Module_10_JSON_Persistence_and_View_Model_Tests_Tutorial.docx
+++ b/Tutorials/Module 10/Module_10_JSON_Persistence_and_View_Model_Tests_Tutorial.docx
@@ -81,6 +81,55 @@
     </w:p>
     <w:p>
       <w:pPr>
+        <w:keepNext/>
+        <w:jc w:val="center"/>
+      </w:pPr>
+      <w:r>
+        <w:drawing>
+          <wp:inline xmlns:a="http://schemas.openxmlformats.org/drawingml/2006/main" xmlns:pic="http://schemas.openxmlformats.org/drawingml/2006/picture">
+            <wp:extent cx="6126480" cy="1633728"/>
+            <wp:docPr id="1" name="Picture 1"/>
+            <wp:cNvGraphicFramePr>
+              <a:graphicFrameLocks noChangeAspect="1"/>
+            </wp:cNvGraphicFramePr>
+            <a:graphic>
+              <a:graphicData uri="http://schemas.openxmlformats.org/drawingml/2006/picture">
+                <pic:pic>
+                  <pic:nvPicPr>
+                    <pic:cNvPr id="0" name="module-10-concept.png"/>
+                    <pic:cNvPicPr/>
+                  </pic:nvPicPr>
+                  <pic:blipFill>
+                    <a:blip r:embed="rId9"/>
+                    <a:stretch>
+                      <a:fillRect/>
+                    </a:stretch>
+                  </pic:blipFill>
+                  <pic:spPr>
+                    <a:xfrm>
+                      <a:off x="0" y="0"/>
+                      <a:ext cx="6126480" cy="1633728"/>
+                    </a:xfrm>
+                    <a:prstGeom prst="rect"/>
+                  </pic:spPr>
+                </pic:pic>
+              </a:graphicData>
+            </a:graphic>
+          </wp:inline>
+        </w:drawing>
+      </w:r>
+    </w:p>
+    <w:p>
+      <w:pPr>
+        <w:pStyle w:val="Caption"/>
+        <w:keepLines/>
+      </w:pPr>
+      <w:r>
+        <w:t>Figure. The view model uses the service contract; the JSON implementation saves and reloads the collection.</w:t>
+      </w:r>
+    </w:p>
+    <w:p>
+      <w:pPr>
         <w:pStyle w:val="Heading1"/>
       </w:pPr>
       <w:r>
@@ -123,6 +172,104 @@
     <w:p>
       <w:r>
         <w:t>Check. A new app run restores the saved list, including edits and deletions.</w:t>
+      </w:r>
+    </w:p>
+    <w:p>
+      <w:pPr>
+        <w:keepNext/>
+        <w:jc w:val="center"/>
+      </w:pPr>
+      <w:r>
+        <w:drawing>
+          <wp:inline xmlns:a="http://schemas.openxmlformats.org/drawingml/2006/main" xmlns:pic="http://schemas.openxmlformats.org/drawingml/2006/picture">
+            <wp:extent cx="6126480" cy="3151991"/>
+            <wp:docPr id="2" name="Picture 2"/>
+            <wp:cNvGraphicFramePr>
+              <a:graphicFrameLocks noChangeAspect="1"/>
+            </wp:cNvGraphicFramePr>
+            <a:graphic>
+              <a:graphicData uri="http://schemas.openxmlformats.org/drawingml/2006/picture">
+                <pic:pic>
+                  <pic:nvPicPr>
+                    <pic:cNvPr id="0" name="saved-item.png"/>
+                    <pic:cNvPicPr/>
+                  </pic:nvPicPr>
+                  <pic:blipFill>
+                    <a:blip r:embed="rId10"/>
+                    <a:stretch>
+                      <a:fillRect/>
+                    </a:stretch>
+                  </pic:blipFill>
+                  <pic:spPr>
+                    <a:xfrm>
+                      <a:off x="0" y="0"/>
+                      <a:ext cx="6126480" cy="3151991"/>
+                    </a:xfrm>
+                    <a:prstGeom prst="rect"/>
+                  </pic:spPr>
+                </pic:pic>
+              </a:graphicData>
+            </a:graphic>
+          </wp:inline>
+        </w:drawing>
+      </w:r>
+    </w:p>
+    <w:p>
+      <w:pPr>
+        <w:pStyle w:val="Caption"/>
+        <w:keepLines/>
+      </w:pPr>
+      <w:r>
+        <w:t>Figure. The new item appears after it has been saved.</w:t>
+      </w:r>
+    </w:p>
+    <w:p>
+      <w:pPr>
+        <w:keepNext/>
+        <w:jc w:val="center"/>
+      </w:pPr>
+      <w:r>
+        <w:drawing>
+          <wp:inline xmlns:a="http://schemas.openxmlformats.org/drawingml/2006/main" xmlns:pic="http://schemas.openxmlformats.org/drawingml/2006/picture">
+            <wp:extent cx="6126480" cy="3151991"/>
+            <wp:docPr id="3" name="Picture 3"/>
+            <wp:cNvGraphicFramePr>
+              <a:graphicFrameLocks noChangeAspect="1"/>
+            </wp:cNvGraphicFramePr>
+            <a:graphic>
+              <a:graphicData uri="http://schemas.openxmlformats.org/drawingml/2006/picture">
+                <pic:pic>
+                  <pic:nvPicPr>
+                    <pic:cNvPr id="0" name="reloaded-item.png"/>
+                    <pic:cNvPicPr/>
+                  </pic:nvPicPr>
+                  <pic:blipFill>
+                    <a:blip r:embed="rId11"/>
+                    <a:stretch>
+                      <a:fillRect/>
+                    </a:stretch>
+                  </pic:blipFill>
+                  <pic:spPr>
+                    <a:xfrm>
+                      <a:off x="0" y="0"/>
+                      <a:ext cx="6126480" cy="3151991"/>
+                    </a:xfrm>
+                    <a:prstGeom prst="rect"/>
+                  </pic:spPr>
+                </pic:pic>
+              </a:graphicData>
+            </a:graphic>
+          </wp:inline>
+        </w:drawing>
+      </w:r>
+    </w:p>
+    <w:p>
+      <w:pPr>
+        <w:pStyle w:val="Caption"/>
+        <w:keepLines/>
+      </w:pPr>
+      <w:r>
+        <w:t>Figure. The same item appears after closing and reopening the application.</w:t>
       </w:r>
     </w:p>
     <w:p>

</xml_diff>